<commit_message>
Unit 10: worksheet and Section 8 are about the student's own dream home
Removes the client report from the university worksheet. Part 2 is the
student's dream home plan and Part 3 is six sentences about it. Site text and
teacher guide match.

Co-Authored-By: Claude Sonnet 5.5 <noreply@anthropic.com>
</commit_message>
<xml_diff>
--- a/_deliverables/EFC-Unit10-University-Worksheet.docx
+++ b/_deliverables/EFC-Unit10-University-Worksheet.docx
@@ -57,7 +57,7 @@
           <w:sz w:val="22"/>
           <w:szCs w:val="22"/>
         </w:rPr>
-        <w:t xml:space="preserve">Worksheet: Client Report, Design Plan, and Presentation</w:t>
+        <w:t xml:space="preserve">Worksheet: Design your dream home</w:t>
       </w:r>
     </w:p>
     <w:tbl>
@@ -860,7 +860,7 @@
           <w:top w:val="single" w:color="000000" w:sz="12" w:space="3"/>
           <w:bottom w:val="single" w:color="000000" w:sz="4" w:space="3"/>
         </w:pBdr>
-        <w:spacing w:after="80" w:before="160"/>
+        <w:spacing w:after="80" w:before="170"/>
       </w:pPr>
       <w:r>
         <w:rPr>
@@ -871,7 +871,7 @@
           <w:sz w:val="25"/>
           <w:szCs w:val="25"/>
         </w:rPr>
-        <w:t xml:space="preserve">Part 2. Client Report</w:t>
+        <w:t xml:space="preserve">Part 2. My Dream Home Plan</w:t>
       </w:r>
     </w:p>
     <w:p>
@@ -887,52 +887,7 @@
           <w:sz w:val="21"/>
           <w:szCs w:val="21"/>
         </w:rPr>
-        <w:t xml:space="preserve">Use your work from Sections 5 and 6.</w:t>
-      </w:r>
-    </w:p>
-    <w:p>
-      <w:pPr>
-        <w:spacing w:after="100"/>
-      </w:pPr>
-      <w:r>
-        <w:rPr>
-          <w:rFonts w:ascii="Arial" w:cs="Arial" w:eastAsia="Arial" w:hAnsi="Arial"/>
-          <w:b/>
-          <w:bCs/>
-          <w:color w:val="000000"/>
-          <w:sz w:val="24"/>
-          <w:szCs w:val="24"/>
-        </w:rPr>
-        <w:t xml:space="preserve">Client: </w:t>
-      </w:r>
-      <w:r>
-        <w:rPr>
-          <w:rFonts w:ascii="Arial" w:cs="Arial" w:eastAsia="Arial" w:hAnsi="Arial"/>
-          <w:color w:val="000000"/>
-          <w:sz w:val="24"/>
-          <w:szCs w:val="24"/>
-        </w:rPr>
-        <w:t xml:space="preserve">_______________</w:t>
-      </w:r>
-      <w:r>
-        <w:rPr>
-          <w:rFonts w:ascii="Arial" w:cs="Arial" w:eastAsia="Arial" w:hAnsi="Arial"/>
-          <w:b/>
-          <w:bCs/>
-          <w:color w:val="000000"/>
-          <w:sz w:val="24"/>
-          <w:szCs w:val="24"/>
-        </w:rPr>
-        <w:t xml:space="preserve">     Coins: </w:t>
-      </w:r>
-      <w:r>
-        <w:rPr>
-          <w:rFonts w:ascii="Arial" w:cs="Arial" w:eastAsia="Arial" w:hAnsi="Arial"/>
-          <w:color w:val="000000"/>
-          <w:sz w:val="24"/>
-          <w:szCs w:val="24"/>
-        </w:rPr>
-        <w:t xml:space="preserve">_____</w:t>
+        <w:t xml:space="preserve">You have 10 coins. Choose for your own dream home. Use your Design Your Home choices.</w:t>
       </w:r>
     </w:p>
     <w:tbl>
@@ -948,15 +903,15 @@
         </w:tblBorders>
       </w:tblPr>
       <w:tblGrid>
-        <w:gridCol w:w="2900"/>
-        <w:gridCol w:w="2500"/>
+        <w:gridCol w:w="2300"/>
+        <w:gridCol w:w="2700"/>
         <w:gridCol w:w="1000"/>
-        <w:gridCol w:w="3506"/>
+        <w:gridCol w:w="3906"/>
       </w:tblGrid>
       <w:tr>
         <w:tc>
           <w:tcPr>
-            <w:tcW w:type="dxa" w:w="2900"/>
+            <w:tcW w:type="dxa" w:w="2300"/>
             <w:tcBorders>
               <w:top w:val="single" w:color="000000" w:sz="6"/>
               <w:left w:val="single" w:color="000000" w:sz="6"/>
@@ -981,13 +936,13 @@
                 <w:sz w:val="21"/>
                 <w:szCs w:val="21"/>
               </w:rPr>
-              <w:t xml:space="preserve">What the client wants</w:t>
-            </w:r>
-          </w:p>
-        </w:tc>
-        <w:tc>
-          <w:tcPr>
-            <w:tcW w:type="dxa" w:w="2500"/>
+              <w:t xml:space="preserve">Feature</w:t>
+            </w:r>
+          </w:p>
+        </w:tc>
+        <w:tc>
+          <w:tcPr>
+            <w:tcW w:type="dxa" w:w="2700"/>
             <w:tcBorders>
               <w:top w:val="single" w:color="000000" w:sz="6"/>
               <w:left w:val="single" w:color="000000" w:sz="6"/>
@@ -1012,7 +967,7 @@
                 <w:sz w:val="21"/>
                 <w:szCs w:val="21"/>
               </w:rPr>
-              <w:t xml:space="preserve">What I chose</w:t>
+              <w:t xml:space="preserve">My choice</w:t>
             </w:r>
           </w:p>
         </w:tc>
@@ -1049,7 +1004,7 @@
         </w:tc>
         <w:tc>
           <w:tcPr>
-            <w:tcW w:type="dxa" w:w="3506"/>
+            <w:tcW w:type="dxa" w:w="3906"/>
             <w:tcBorders>
               <w:top w:val="single" w:color="000000" w:sz="6"/>
               <w:left w:val="single" w:color="000000" w:sz="6"/>
@@ -1074,18 +1029,18 @@
                 <w:sz w:val="21"/>
                 <w:szCs w:val="21"/>
               </w:rPr>
-              <w:t xml:space="preserve">Why? I choose ___ because ___.</w:t>
+              <w:t xml:space="preserve">Why? I want ___ because ___.</w:t>
             </w:r>
           </w:p>
         </w:tc>
       </w:tr>
       <w:tr>
         <w:trPr>
-          <w:trHeight w:val="980" w:hRule="atLeast"/>
+          <w:trHeight w:val="650" w:hRule="atLeast"/>
         </w:trPr>
         <w:tc>
           <w:tcPr>
-            <w:tcW w:type="dxa" w:w="2900"/>
+            <w:tcW w:type="dxa" w:w="2300"/>
             <w:tcBorders>
               <w:top w:val="single" w:color="000000" w:sz="6"/>
               <w:left w:val="single" w:color="000000" w:sz="6"/>
@@ -1104,6 +1059,39 @@
             <w:r>
               <w:rPr>
                 <w:rFonts w:ascii="Arial" w:cs="Arial" w:eastAsia="Arial" w:hAnsi="Arial"/>
+                <w:b/>
+                <w:bCs/>
+                <w:color w:val="000000"/>
+                <w:sz w:val="21"/>
+                <w:szCs w:val="21"/>
+              </w:rPr>
+              <w:t xml:space="preserve">Bedrooms</w:t>
+            </w:r>
+          </w:p>
+        </w:tc>
+        <w:tc>
+          <w:tcPr>
+            <w:tcW w:type="dxa" w:w="2700"/>
+            <w:tcBorders>
+              <w:top w:val="single" w:color="000000" w:sz="6"/>
+              <w:left w:val="single" w:color="000000" w:sz="6"/>
+              <w:bottom w:val="single" w:color="000000" w:sz="6"/>
+              <w:right w:val="single" w:color="000000" w:sz="6"/>
+            </w:tcBorders>
+            <w:tcMar>
+              <w:top w:type="dxa" w:w="90"/>
+              <w:left w:type="dxa" w:w="90"/>
+              <w:bottom w:type="dxa" w:w="90"/>
+              <w:right w:type="dxa" w:w="70"/>
+            </w:tcMar>
+            <w:vAlign w:val="center"/>
+          </w:tcPr>
+          <w:p>
+            <w:r>
+              <w:rPr>
+                <w:rFonts w:ascii="Arial" w:cs="Arial" w:eastAsia="Arial" w:hAnsi="Arial"/>
+                <w:b w:val="false"/>
+                <w:bCs w:val="false"/>
                 <w:color w:val="000000"/>
                 <w:sz w:val="21"/>
                 <w:szCs w:val="21"/>
@@ -1114,7 +1102,7 @@
         </w:tc>
         <w:tc>
           <w:tcPr>
-            <w:tcW w:type="dxa" w:w="2500"/>
+            <w:tcW w:type="dxa" w:w="1000"/>
             <w:tcBorders>
               <w:top w:val="single" w:color="000000" w:sz="6"/>
               <w:left w:val="single" w:color="000000" w:sz="6"/>
@@ -1133,6 +1121,8 @@
             <w:r>
               <w:rPr>
                 <w:rFonts w:ascii="Arial" w:cs="Arial" w:eastAsia="Arial" w:hAnsi="Arial"/>
+                <w:b w:val="false"/>
+                <w:bCs w:val="false"/>
                 <w:color w:val="000000"/>
                 <w:sz w:val="21"/>
                 <w:szCs w:val="21"/>
@@ -1143,7 +1133,7 @@
         </w:tc>
         <w:tc>
           <w:tcPr>
-            <w:tcW w:type="dxa" w:w="1000"/>
+            <w:tcW w:type="dxa" w:w="3906"/>
             <w:tcBorders>
               <w:top w:val="single" w:color="000000" w:sz="6"/>
               <w:left w:val="single" w:color="000000" w:sz="6"/>
@@ -1162,35 +1152,8 @@
             <w:r>
               <w:rPr>
                 <w:rFonts w:ascii="Arial" w:cs="Arial" w:eastAsia="Arial" w:hAnsi="Arial"/>
-                <w:color w:val="000000"/>
-                <w:sz w:val="21"/>
-                <w:szCs w:val="21"/>
-              </w:rPr>
-              <w:t xml:space="preserve"/>
-            </w:r>
-          </w:p>
-        </w:tc>
-        <w:tc>
-          <w:tcPr>
-            <w:tcW w:type="dxa" w:w="3506"/>
-            <w:tcBorders>
-              <w:top w:val="single" w:color="000000" w:sz="6"/>
-              <w:left w:val="single" w:color="000000" w:sz="6"/>
-              <w:bottom w:val="single" w:color="000000" w:sz="6"/>
-              <w:right w:val="single" w:color="000000" w:sz="6"/>
-            </w:tcBorders>
-            <w:tcMar>
-              <w:top w:type="dxa" w:w="90"/>
-              <w:left w:type="dxa" w:w="90"/>
-              <w:bottom w:type="dxa" w:w="90"/>
-              <w:right w:type="dxa" w:w="70"/>
-            </w:tcMar>
-            <w:vAlign w:val="center"/>
-          </w:tcPr>
-          <w:p>
-            <w:r>
-              <w:rPr>
-                <w:rFonts w:ascii="Arial" w:cs="Arial" w:eastAsia="Arial" w:hAnsi="Arial"/>
+                <w:b w:val="false"/>
+                <w:bCs w:val="false"/>
                 <w:color w:val="000000"/>
                 <w:sz w:val="21"/>
                 <w:szCs w:val="21"/>
@@ -1202,11 +1165,11 @@
       </w:tr>
       <w:tr>
         <w:trPr>
-          <w:trHeight w:val="980" w:hRule="atLeast"/>
+          <w:trHeight w:val="650" w:hRule="atLeast"/>
         </w:trPr>
         <w:tc>
           <w:tcPr>
-            <w:tcW w:type="dxa" w:w="2900"/>
+            <w:tcW w:type="dxa" w:w="2300"/>
             <w:tcBorders>
               <w:top w:val="single" w:color="000000" w:sz="6"/>
               <w:left w:val="single" w:color="000000" w:sz="6"/>
@@ -1225,6 +1188,39 @@
             <w:r>
               <w:rPr>
                 <w:rFonts w:ascii="Arial" w:cs="Arial" w:eastAsia="Arial" w:hAnsi="Arial"/>
+                <w:b/>
+                <w:bCs/>
+                <w:color w:val="000000"/>
+                <w:sz w:val="21"/>
+                <w:szCs w:val="21"/>
+              </w:rPr>
+              <w:t xml:space="preserve">Bathrooms</w:t>
+            </w:r>
+          </w:p>
+        </w:tc>
+        <w:tc>
+          <w:tcPr>
+            <w:tcW w:type="dxa" w:w="2700"/>
+            <w:tcBorders>
+              <w:top w:val="single" w:color="000000" w:sz="6"/>
+              <w:left w:val="single" w:color="000000" w:sz="6"/>
+              <w:bottom w:val="single" w:color="000000" w:sz="6"/>
+              <w:right w:val="single" w:color="000000" w:sz="6"/>
+            </w:tcBorders>
+            <w:tcMar>
+              <w:top w:type="dxa" w:w="90"/>
+              <w:left w:type="dxa" w:w="90"/>
+              <w:bottom w:type="dxa" w:w="90"/>
+              <w:right w:type="dxa" w:w="70"/>
+            </w:tcMar>
+            <w:vAlign w:val="center"/>
+          </w:tcPr>
+          <w:p>
+            <w:r>
+              <w:rPr>
+                <w:rFonts w:ascii="Arial" w:cs="Arial" w:eastAsia="Arial" w:hAnsi="Arial"/>
+                <w:b w:val="false"/>
+                <w:bCs w:val="false"/>
                 <w:color w:val="000000"/>
                 <w:sz w:val="21"/>
                 <w:szCs w:val="21"/>
@@ -1235,7 +1231,7 @@
         </w:tc>
         <w:tc>
           <w:tcPr>
-            <w:tcW w:type="dxa" w:w="2500"/>
+            <w:tcW w:type="dxa" w:w="1000"/>
             <w:tcBorders>
               <w:top w:val="single" w:color="000000" w:sz="6"/>
               <w:left w:val="single" w:color="000000" w:sz="6"/>
@@ -1254,6 +1250,8 @@
             <w:r>
               <w:rPr>
                 <w:rFonts w:ascii="Arial" w:cs="Arial" w:eastAsia="Arial" w:hAnsi="Arial"/>
+                <w:b w:val="false"/>
+                <w:bCs w:val="false"/>
                 <w:color w:val="000000"/>
                 <w:sz w:val="21"/>
                 <w:szCs w:val="21"/>
@@ -1264,7 +1262,7 @@
         </w:tc>
         <w:tc>
           <w:tcPr>
-            <w:tcW w:type="dxa" w:w="1000"/>
+            <w:tcW w:type="dxa" w:w="3906"/>
             <w:tcBorders>
               <w:top w:val="single" w:color="000000" w:sz="6"/>
               <w:left w:val="single" w:color="000000" w:sz="6"/>
@@ -1283,35 +1281,8 @@
             <w:r>
               <w:rPr>
                 <w:rFonts w:ascii="Arial" w:cs="Arial" w:eastAsia="Arial" w:hAnsi="Arial"/>
-                <w:color w:val="000000"/>
-                <w:sz w:val="21"/>
-                <w:szCs w:val="21"/>
-              </w:rPr>
-              <w:t xml:space="preserve"/>
-            </w:r>
-          </w:p>
-        </w:tc>
-        <w:tc>
-          <w:tcPr>
-            <w:tcW w:type="dxa" w:w="3506"/>
-            <w:tcBorders>
-              <w:top w:val="single" w:color="000000" w:sz="6"/>
-              <w:left w:val="single" w:color="000000" w:sz="6"/>
-              <w:bottom w:val="single" w:color="000000" w:sz="6"/>
-              <w:right w:val="single" w:color="000000" w:sz="6"/>
-            </w:tcBorders>
-            <w:tcMar>
-              <w:top w:type="dxa" w:w="90"/>
-              <w:left w:type="dxa" w:w="90"/>
-              <w:bottom w:type="dxa" w:w="90"/>
-              <w:right w:type="dxa" w:w="70"/>
-            </w:tcMar>
-            <w:vAlign w:val="center"/>
-          </w:tcPr>
-          <w:p>
-            <w:r>
-              <w:rPr>
-                <w:rFonts w:ascii="Arial" w:cs="Arial" w:eastAsia="Arial" w:hAnsi="Arial"/>
+                <w:b w:val="false"/>
+                <w:bCs w:val="false"/>
                 <w:color w:val="000000"/>
                 <w:sz w:val="21"/>
                 <w:szCs w:val="21"/>
@@ -1323,11 +1294,11 @@
       </w:tr>
       <w:tr>
         <w:trPr>
-          <w:trHeight w:val="980" w:hRule="atLeast"/>
+          <w:trHeight w:val="650" w:hRule="atLeast"/>
         </w:trPr>
         <w:tc>
           <w:tcPr>
-            <w:tcW w:type="dxa" w:w="2900"/>
+            <w:tcW w:type="dxa" w:w="2300"/>
             <w:tcBorders>
               <w:top w:val="single" w:color="000000" w:sz="6"/>
               <w:left w:val="single" w:color="000000" w:sz="6"/>
@@ -1346,6 +1317,39 @@
             <w:r>
               <w:rPr>
                 <w:rFonts w:ascii="Arial" w:cs="Arial" w:eastAsia="Arial" w:hAnsi="Arial"/>
+                <w:b/>
+                <w:bCs/>
+                <w:color w:val="000000"/>
+                <w:sz w:val="21"/>
+                <w:szCs w:val="21"/>
+              </w:rPr>
+              <w:t xml:space="preserve">Kitchen</w:t>
+            </w:r>
+          </w:p>
+        </w:tc>
+        <w:tc>
+          <w:tcPr>
+            <w:tcW w:type="dxa" w:w="2700"/>
+            <w:tcBorders>
+              <w:top w:val="single" w:color="000000" w:sz="6"/>
+              <w:left w:val="single" w:color="000000" w:sz="6"/>
+              <w:bottom w:val="single" w:color="000000" w:sz="6"/>
+              <w:right w:val="single" w:color="000000" w:sz="6"/>
+            </w:tcBorders>
+            <w:tcMar>
+              <w:top w:type="dxa" w:w="90"/>
+              <w:left w:type="dxa" w:w="90"/>
+              <w:bottom w:type="dxa" w:w="90"/>
+              <w:right w:type="dxa" w:w="70"/>
+            </w:tcMar>
+            <w:vAlign w:val="center"/>
+          </w:tcPr>
+          <w:p>
+            <w:r>
+              <w:rPr>
+                <w:rFonts w:ascii="Arial" w:cs="Arial" w:eastAsia="Arial" w:hAnsi="Arial"/>
+                <w:b w:val="false"/>
+                <w:bCs w:val="false"/>
                 <w:color w:val="000000"/>
                 <w:sz w:val="21"/>
                 <w:szCs w:val="21"/>
@@ -1356,7 +1360,7 @@
         </w:tc>
         <w:tc>
           <w:tcPr>
-            <w:tcW w:type="dxa" w:w="2500"/>
+            <w:tcW w:type="dxa" w:w="1000"/>
             <w:tcBorders>
               <w:top w:val="single" w:color="000000" w:sz="6"/>
               <w:left w:val="single" w:color="000000" w:sz="6"/>
@@ -1375,6 +1379,8 @@
             <w:r>
               <w:rPr>
                 <w:rFonts w:ascii="Arial" w:cs="Arial" w:eastAsia="Arial" w:hAnsi="Arial"/>
+                <w:b w:val="false"/>
+                <w:bCs w:val="false"/>
                 <w:color w:val="000000"/>
                 <w:sz w:val="21"/>
                 <w:szCs w:val="21"/>
@@ -1385,7 +1391,7 @@
         </w:tc>
         <w:tc>
           <w:tcPr>
-            <w:tcW w:type="dxa" w:w="1000"/>
+            <w:tcW w:type="dxa" w:w="3906"/>
             <w:tcBorders>
               <w:top w:val="single" w:color="000000" w:sz="6"/>
               <w:left w:val="single" w:color="000000" w:sz="6"/>
@@ -1404,35 +1410,8 @@
             <w:r>
               <w:rPr>
                 <w:rFonts w:ascii="Arial" w:cs="Arial" w:eastAsia="Arial" w:hAnsi="Arial"/>
-                <w:color w:val="000000"/>
-                <w:sz w:val="21"/>
-                <w:szCs w:val="21"/>
-              </w:rPr>
-              <w:t xml:space="preserve"/>
-            </w:r>
-          </w:p>
-        </w:tc>
-        <w:tc>
-          <w:tcPr>
-            <w:tcW w:type="dxa" w:w="3506"/>
-            <w:tcBorders>
-              <w:top w:val="single" w:color="000000" w:sz="6"/>
-              <w:left w:val="single" w:color="000000" w:sz="6"/>
-              <w:bottom w:val="single" w:color="000000" w:sz="6"/>
-              <w:right w:val="single" w:color="000000" w:sz="6"/>
-            </w:tcBorders>
-            <w:tcMar>
-              <w:top w:type="dxa" w:w="90"/>
-              <w:left w:type="dxa" w:w="90"/>
-              <w:bottom w:type="dxa" w:w="90"/>
-              <w:right w:type="dxa" w:w="70"/>
-            </w:tcMar>
-            <w:vAlign w:val="center"/>
-          </w:tcPr>
-          <w:p>
-            <w:r>
-              <w:rPr>
-                <w:rFonts w:ascii="Arial" w:cs="Arial" w:eastAsia="Arial" w:hAnsi="Arial"/>
+                <w:b w:val="false"/>
+                <w:bCs w:val="false"/>
                 <w:color w:val="000000"/>
                 <w:sz w:val="21"/>
                 <w:szCs w:val="21"/>
@@ -1443,9 +1422,12 @@
         </w:tc>
       </w:tr>
       <w:tr>
-        <w:tc>
-          <w:tcPr>
-            <w:tcW w:type="dxa" w:w="2900"/>
+        <w:trPr>
+          <w:trHeight w:val="650" w:hRule="atLeast"/>
+        </w:trPr>
+        <w:tc>
+          <w:tcPr>
+            <w:tcW w:type="dxa" w:w="2300"/>
             <w:tcBorders>
               <w:top w:val="single" w:color="000000" w:sz="6"/>
               <w:left w:val="single" w:color="000000" w:sz="6"/>
@@ -1470,13 +1452,111 @@
                 <w:sz w:val="21"/>
                 <w:szCs w:val="21"/>
               </w:rPr>
-              <w:t xml:space="preserve">Total coins used</w:t>
-            </w:r>
-          </w:p>
-        </w:tc>
-        <w:tc>
-          <w:tcPr>
-            <w:tcW w:type="dxa" w:w="2500"/>
+              <w:t xml:space="preserve">Extra 1</w:t>
+            </w:r>
+          </w:p>
+        </w:tc>
+        <w:tc>
+          <w:tcPr>
+            <w:tcW w:type="dxa" w:w="2700"/>
+            <w:tcBorders>
+              <w:top w:val="single" w:color="000000" w:sz="6"/>
+              <w:left w:val="single" w:color="000000" w:sz="6"/>
+              <w:bottom w:val="single" w:color="000000" w:sz="6"/>
+              <w:right w:val="single" w:color="000000" w:sz="6"/>
+            </w:tcBorders>
+            <w:tcMar>
+              <w:top w:type="dxa" w:w="90"/>
+              <w:left w:type="dxa" w:w="90"/>
+              <w:bottom w:type="dxa" w:w="90"/>
+              <w:right w:type="dxa" w:w="70"/>
+            </w:tcMar>
+            <w:vAlign w:val="center"/>
+          </w:tcPr>
+          <w:p>
+            <w:r>
+              <w:rPr>
+                <w:rFonts w:ascii="Arial" w:cs="Arial" w:eastAsia="Arial" w:hAnsi="Arial"/>
+                <w:b w:val="false"/>
+                <w:bCs w:val="false"/>
+                <w:color w:val="000000"/>
+                <w:sz w:val="21"/>
+                <w:szCs w:val="21"/>
+              </w:rPr>
+              <w:t xml:space="preserve"/>
+            </w:r>
+          </w:p>
+        </w:tc>
+        <w:tc>
+          <w:tcPr>
+            <w:tcW w:type="dxa" w:w="1000"/>
+            <w:tcBorders>
+              <w:top w:val="single" w:color="000000" w:sz="6"/>
+              <w:left w:val="single" w:color="000000" w:sz="6"/>
+              <w:bottom w:val="single" w:color="000000" w:sz="6"/>
+              <w:right w:val="single" w:color="000000" w:sz="6"/>
+            </w:tcBorders>
+            <w:tcMar>
+              <w:top w:type="dxa" w:w="90"/>
+              <w:left w:type="dxa" w:w="90"/>
+              <w:bottom w:type="dxa" w:w="90"/>
+              <w:right w:type="dxa" w:w="70"/>
+            </w:tcMar>
+            <w:vAlign w:val="center"/>
+          </w:tcPr>
+          <w:p>
+            <w:r>
+              <w:rPr>
+                <w:rFonts w:ascii="Arial" w:cs="Arial" w:eastAsia="Arial" w:hAnsi="Arial"/>
+                <w:b w:val="false"/>
+                <w:bCs w:val="false"/>
+                <w:color w:val="000000"/>
+                <w:sz w:val="21"/>
+                <w:szCs w:val="21"/>
+              </w:rPr>
+              <w:t xml:space="preserve"/>
+            </w:r>
+          </w:p>
+        </w:tc>
+        <w:tc>
+          <w:tcPr>
+            <w:tcW w:type="dxa" w:w="3906"/>
+            <w:tcBorders>
+              <w:top w:val="single" w:color="000000" w:sz="6"/>
+              <w:left w:val="single" w:color="000000" w:sz="6"/>
+              <w:bottom w:val="single" w:color="000000" w:sz="6"/>
+              <w:right w:val="single" w:color="000000" w:sz="6"/>
+            </w:tcBorders>
+            <w:tcMar>
+              <w:top w:type="dxa" w:w="90"/>
+              <w:left w:type="dxa" w:w="90"/>
+              <w:bottom w:type="dxa" w:w="90"/>
+              <w:right w:type="dxa" w:w="70"/>
+            </w:tcMar>
+            <w:vAlign w:val="center"/>
+          </w:tcPr>
+          <w:p>
+            <w:r>
+              <w:rPr>
+                <w:rFonts w:ascii="Arial" w:cs="Arial" w:eastAsia="Arial" w:hAnsi="Arial"/>
+                <w:b w:val="false"/>
+                <w:bCs w:val="false"/>
+                <w:color w:val="000000"/>
+                <w:sz w:val="21"/>
+                <w:szCs w:val="21"/>
+              </w:rPr>
+              <w:t xml:space="preserve"/>
+            </w:r>
+          </w:p>
+        </w:tc>
+      </w:tr>
+      <w:tr>
+        <w:trPr>
+          <w:trHeight w:val="650" w:hRule="atLeast"/>
+        </w:trPr>
+        <w:tc>
+          <w:tcPr>
+            <w:tcW w:type="dxa" w:w="2300"/>
             <w:tcBorders>
               <w:top w:val="single" w:color="000000" w:sz="6"/>
               <w:left w:val="single" w:color="000000" w:sz="6"/>
@@ -1501,6 +1581,37 @@
                 <w:sz w:val="21"/>
                 <w:szCs w:val="21"/>
               </w:rPr>
+              <w:t xml:space="preserve">Extra 2</w:t>
+            </w:r>
+          </w:p>
+        </w:tc>
+        <w:tc>
+          <w:tcPr>
+            <w:tcW w:type="dxa" w:w="2700"/>
+            <w:tcBorders>
+              <w:top w:val="single" w:color="000000" w:sz="6"/>
+              <w:left w:val="single" w:color="000000" w:sz="6"/>
+              <w:bottom w:val="single" w:color="000000" w:sz="6"/>
+              <w:right w:val="single" w:color="000000" w:sz="6"/>
+            </w:tcBorders>
+            <w:tcMar>
+              <w:top w:type="dxa" w:w="90"/>
+              <w:left w:type="dxa" w:w="90"/>
+              <w:bottom w:type="dxa" w:w="90"/>
+              <w:right w:type="dxa" w:w="70"/>
+            </w:tcMar>
+            <w:vAlign w:val="center"/>
+          </w:tcPr>
+          <w:p>
+            <w:r>
+              <w:rPr>
+                <w:rFonts w:ascii="Arial" w:cs="Arial" w:eastAsia="Arial" w:hAnsi="Arial"/>
+                <w:b w:val="false"/>
+                <w:bCs w:val="false"/>
+                <w:color w:val="000000"/>
+                <w:sz w:val="21"/>
+                <w:szCs w:val="21"/>
+              </w:rPr>
               <w:t xml:space="preserve"/>
             </w:r>
           </w:p>
@@ -1508,6 +1619,73 @@
         <w:tc>
           <w:tcPr>
             <w:tcW w:type="dxa" w:w="1000"/>
+            <w:tcBorders>
+              <w:top w:val="single" w:color="000000" w:sz="6"/>
+              <w:left w:val="single" w:color="000000" w:sz="6"/>
+              <w:bottom w:val="single" w:color="000000" w:sz="6"/>
+              <w:right w:val="single" w:color="000000" w:sz="6"/>
+            </w:tcBorders>
+            <w:tcMar>
+              <w:top w:type="dxa" w:w="90"/>
+              <w:left w:type="dxa" w:w="90"/>
+              <w:bottom w:type="dxa" w:w="90"/>
+              <w:right w:type="dxa" w:w="70"/>
+            </w:tcMar>
+            <w:vAlign w:val="center"/>
+          </w:tcPr>
+          <w:p>
+            <w:r>
+              <w:rPr>
+                <w:rFonts w:ascii="Arial" w:cs="Arial" w:eastAsia="Arial" w:hAnsi="Arial"/>
+                <w:b w:val="false"/>
+                <w:bCs w:val="false"/>
+                <w:color w:val="000000"/>
+                <w:sz w:val="21"/>
+                <w:szCs w:val="21"/>
+              </w:rPr>
+              <w:t xml:space="preserve"/>
+            </w:r>
+          </w:p>
+        </w:tc>
+        <w:tc>
+          <w:tcPr>
+            <w:tcW w:type="dxa" w:w="3906"/>
+            <w:tcBorders>
+              <w:top w:val="single" w:color="000000" w:sz="6"/>
+              <w:left w:val="single" w:color="000000" w:sz="6"/>
+              <w:bottom w:val="single" w:color="000000" w:sz="6"/>
+              <w:right w:val="single" w:color="000000" w:sz="6"/>
+            </w:tcBorders>
+            <w:tcMar>
+              <w:top w:type="dxa" w:w="90"/>
+              <w:left w:type="dxa" w:w="90"/>
+              <w:bottom w:type="dxa" w:w="90"/>
+              <w:right w:type="dxa" w:w="70"/>
+            </w:tcMar>
+            <w:vAlign w:val="center"/>
+          </w:tcPr>
+          <w:p>
+            <w:r>
+              <w:rPr>
+                <w:rFonts w:ascii="Arial" w:cs="Arial" w:eastAsia="Arial" w:hAnsi="Arial"/>
+                <w:b w:val="false"/>
+                <w:bCs w:val="false"/>
+                <w:color w:val="000000"/>
+                <w:sz w:val="21"/>
+                <w:szCs w:val="21"/>
+              </w:rPr>
+              <w:t xml:space="preserve"/>
+            </w:r>
+          </w:p>
+        </w:tc>
+      </w:tr>
+      <w:tr>
+        <w:trPr>
+          <w:trHeight w:val="650" w:hRule="atLeast"/>
+        </w:trPr>
+        <w:tc>
+          <w:tcPr>
+            <w:tcW w:type="dxa" w:w="2300"/>
             <w:tcBorders>
               <w:top w:val="single" w:color="000000" w:sz="6"/>
               <w:left w:val="single" w:color="000000" w:sz="6"/>
@@ -1532,13 +1710,108 @@
                 <w:sz w:val="21"/>
                 <w:szCs w:val="21"/>
               </w:rPr>
+              <w:t xml:space="preserve">Extra 3</w:t>
+            </w:r>
+          </w:p>
+        </w:tc>
+        <w:tc>
+          <w:tcPr>
+            <w:tcW w:type="dxa" w:w="2700"/>
+            <w:tcBorders>
+              <w:top w:val="single" w:color="000000" w:sz="6"/>
+              <w:left w:val="single" w:color="000000" w:sz="6"/>
+              <w:bottom w:val="single" w:color="000000" w:sz="6"/>
+              <w:right w:val="single" w:color="000000" w:sz="6"/>
+            </w:tcBorders>
+            <w:tcMar>
+              <w:top w:type="dxa" w:w="90"/>
+              <w:left w:type="dxa" w:w="90"/>
+              <w:bottom w:type="dxa" w:w="90"/>
+              <w:right w:type="dxa" w:w="70"/>
+            </w:tcMar>
+            <w:vAlign w:val="center"/>
+          </w:tcPr>
+          <w:p>
+            <w:r>
+              <w:rPr>
+                <w:rFonts w:ascii="Arial" w:cs="Arial" w:eastAsia="Arial" w:hAnsi="Arial"/>
+                <w:b w:val="false"/>
+                <w:bCs w:val="false"/>
+                <w:color w:val="000000"/>
+                <w:sz w:val="21"/>
+                <w:szCs w:val="21"/>
+              </w:rPr>
               <w:t xml:space="preserve"/>
             </w:r>
           </w:p>
         </w:tc>
         <w:tc>
           <w:tcPr>
-            <w:tcW w:type="dxa" w:w="3506"/>
+            <w:tcW w:type="dxa" w:w="1000"/>
+            <w:tcBorders>
+              <w:top w:val="single" w:color="000000" w:sz="6"/>
+              <w:left w:val="single" w:color="000000" w:sz="6"/>
+              <w:bottom w:val="single" w:color="000000" w:sz="6"/>
+              <w:right w:val="single" w:color="000000" w:sz="6"/>
+            </w:tcBorders>
+            <w:tcMar>
+              <w:top w:type="dxa" w:w="90"/>
+              <w:left w:type="dxa" w:w="90"/>
+              <w:bottom w:type="dxa" w:w="90"/>
+              <w:right w:type="dxa" w:w="70"/>
+            </w:tcMar>
+            <w:vAlign w:val="center"/>
+          </w:tcPr>
+          <w:p>
+            <w:r>
+              <w:rPr>
+                <w:rFonts w:ascii="Arial" w:cs="Arial" w:eastAsia="Arial" w:hAnsi="Arial"/>
+                <w:b w:val="false"/>
+                <w:bCs w:val="false"/>
+                <w:color w:val="000000"/>
+                <w:sz w:val="21"/>
+                <w:szCs w:val="21"/>
+              </w:rPr>
+              <w:t xml:space="preserve"/>
+            </w:r>
+          </w:p>
+        </w:tc>
+        <w:tc>
+          <w:tcPr>
+            <w:tcW w:type="dxa" w:w="3906"/>
+            <w:tcBorders>
+              <w:top w:val="single" w:color="000000" w:sz="6"/>
+              <w:left w:val="single" w:color="000000" w:sz="6"/>
+              <w:bottom w:val="single" w:color="000000" w:sz="6"/>
+              <w:right w:val="single" w:color="000000" w:sz="6"/>
+            </w:tcBorders>
+            <w:tcMar>
+              <w:top w:type="dxa" w:w="90"/>
+              <w:left w:type="dxa" w:w="90"/>
+              <w:bottom w:type="dxa" w:w="90"/>
+              <w:right w:type="dxa" w:w="70"/>
+            </w:tcMar>
+            <w:vAlign w:val="center"/>
+          </w:tcPr>
+          <w:p>
+            <w:r>
+              <w:rPr>
+                <w:rFonts w:ascii="Arial" w:cs="Arial" w:eastAsia="Arial" w:hAnsi="Arial"/>
+                <w:b w:val="false"/>
+                <w:bCs w:val="false"/>
+                <w:color w:val="000000"/>
+                <w:sz w:val="21"/>
+                <w:szCs w:val="21"/>
+              </w:rPr>
+              <w:t xml:space="preserve"/>
+            </w:r>
+          </w:p>
+        </w:tc>
+      </w:tr>
+      <w:tr>
+        <w:tc>
+          <w:tcPr>
+            <w:tcW w:type="dxa" w:w="2300"/>
             <w:tcBorders>
               <w:top w:val="single" w:color="000000" w:sz="6"/>
               <w:left w:val="single" w:color="000000" w:sz="6"/>
@@ -1563,7 +1836,100 @@
                 <w:sz w:val="21"/>
                 <w:szCs w:val="21"/>
               </w:rPr>
-              <w:t xml:space="preserve">____ / ____</w:t>
+              <w:t xml:space="preserve">Total coins used</w:t>
+            </w:r>
+          </w:p>
+        </w:tc>
+        <w:tc>
+          <w:tcPr>
+            <w:tcW w:type="dxa" w:w="2700"/>
+            <w:tcBorders>
+              <w:top w:val="single" w:color="000000" w:sz="6"/>
+              <w:left w:val="single" w:color="000000" w:sz="6"/>
+              <w:bottom w:val="single" w:color="000000" w:sz="6"/>
+              <w:right w:val="single" w:color="000000" w:sz="6"/>
+            </w:tcBorders>
+            <w:tcMar>
+              <w:top w:type="dxa" w:w="90"/>
+              <w:left w:type="dxa" w:w="90"/>
+              <w:bottom w:type="dxa" w:w="90"/>
+              <w:right w:type="dxa" w:w="70"/>
+            </w:tcMar>
+            <w:vAlign w:val="center"/>
+          </w:tcPr>
+          <w:p>
+            <w:r>
+              <w:rPr>
+                <w:rFonts w:ascii="Arial" w:cs="Arial" w:eastAsia="Arial" w:hAnsi="Arial"/>
+                <w:b/>
+                <w:bCs/>
+                <w:color w:val="000000"/>
+                <w:sz w:val="21"/>
+                <w:szCs w:val="21"/>
+              </w:rPr>
+              <w:t xml:space="preserve"/>
+            </w:r>
+          </w:p>
+        </w:tc>
+        <w:tc>
+          <w:tcPr>
+            <w:tcW w:type="dxa" w:w="1000"/>
+            <w:tcBorders>
+              <w:top w:val="single" w:color="000000" w:sz="6"/>
+              <w:left w:val="single" w:color="000000" w:sz="6"/>
+              <w:bottom w:val="single" w:color="000000" w:sz="6"/>
+              <w:right w:val="single" w:color="000000" w:sz="6"/>
+            </w:tcBorders>
+            <w:tcMar>
+              <w:top w:type="dxa" w:w="90"/>
+              <w:left w:type="dxa" w:w="90"/>
+              <w:bottom w:type="dxa" w:w="90"/>
+              <w:right w:type="dxa" w:w="70"/>
+            </w:tcMar>
+            <w:vAlign w:val="center"/>
+          </w:tcPr>
+          <w:p>
+            <w:r>
+              <w:rPr>
+                <w:rFonts w:ascii="Arial" w:cs="Arial" w:eastAsia="Arial" w:hAnsi="Arial"/>
+                <w:b/>
+                <w:bCs/>
+                <w:color w:val="000000"/>
+                <w:sz w:val="21"/>
+                <w:szCs w:val="21"/>
+              </w:rPr>
+              <w:t xml:space="preserve"/>
+            </w:r>
+          </w:p>
+        </w:tc>
+        <w:tc>
+          <w:tcPr>
+            <w:tcW w:type="dxa" w:w="3906"/>
+            <w:tcBorders>
+              <w:top w:val="single" w:color="000000" w:sz="6"/>
+              <w:left w:val="single" w:color="000000" w:sz="6"/>
+              <w:bottom w:val="single" w:color="000000" w:sz="6"/>
+              <w:right w:val="single" w:color="000000" w:sz="6"/>
+            </w:tcBorders>
+            <w:tcMar>
+              <w:top w:type="dxa" w:w="90"/>
+              <w:left w:type="dxa" w:w="90"/>
+              <w:bottom w:type="dxa" w:w="90"/>
+              <w:right w:type="dxa" w:w="70"/>
+            </w:tcMar>
+            <w:vAlign w:val="center"/>
+          </w:tcPr>
+          <w:p>
+            <w:r>
+              <w:rPr>
+                <w:rFonts w:ascii="Arial" w:cs="Arial" w:eastAsia="Arial" w:hAnsi="Arial"/>
+                <w:b/>
+                <w:bCs/>
+                <w:color w:val="000000"/>
+                <w:sz w:val="21"/>
+                <w:szCs w:val="21"/>
+              </w:rPr>
+              <w:t xml:space="preserve">____ / 10</w:t>
             </w:r>
           </w:p>
         </w:tc>
@@ -1625,7 +1991,7 @@
           <w:sz w:val="22"/>
           <w:szCs w:val="22"/>
         </w:rPr>
-        <w:t xml:space="preserve">Design Plan, Writing, and Presentation</w:t>
+        <w:t xml:space="preserve">Write and present your dream home</w:t>
       </w:r>
     </w:p>
     <w:tbl>
@@ -1917,7 +2283,7 @@
           <w:sz w:val="25"/>
           <w:szCs w:val="25"/>
         </w:rPr>
-        <w:t xml:space="preserve">Part 3. My Design Plan</w:t>
+        <w:t xml:space="preserve">Part 3. Write About My Dream Home</w:t>
       </w:r>
     </w:p>
     <w:p>
@@ -1933,7 +2299,7 @@
           <w:sz w:val="21"/>
           <w:szCs w:val="21"/>
         </w:rPr>
-        <w:t xml:space="preserve">You have 10 coins. Choose for your own home.</w:t>
+        <w:t xml:space="preserve">Write 6 sentences about your dream home. Use your plan in Part 2.</w:t>
       </w:r>
     </w:p>
     <w:tbl>
@@ -1949,28 +2315,24 @@
         </w:tblBorders>
       </w:tblPr>
       <w:tblGrid>
-        <w:gridCol w:w="2300"/>
-        <w:gridCol w:w="2700"/>
-        <w:gridCol w:w="1000"/>
-        <w:gridCol w:w="3906"/>
+        <w:gridCol w:w="9906"/>
       </w:tblGrid>
       <w:tr>
         <w:tc>
           <w:tcPr>
-            <w:tcW w:type="dxa" w:w="2300"/>
-            <w:tcBorders>
-              <w:top w:val="single" w:color="000000" w:sz="6"/>
-              <w:left w:val="single" w:color="000000" w:sz="6"/>
-              <w:bottom w:val="single" w:color="000000" w:sz="6"/>
-              <w:right w:val="single" w:color="000000" w:sz="6"/>
-            </w:tcBorders>
-            <w:tcMar>
-              <w:top w:type="dxa" w:w="90"/>
-              <w:left w:type="dxa" w:w="90"/>
-              <w:bottom w:type="dxa" w:w="90"/>
-              <w:right w:type="dxa" w:w="70"/>
-            </w:tcMar>
-            <w:vAlign w:val="center"/>
+            <w:tcW w:type="dxa" w:w="9906"/>
+            <w:tcBorders>
+              <w:top w:val="dashed" w:color="000000" w:sz="8"/>
+              <w:left w:val="dashed" w:color="000000" w:sz="8"/>
+              <w:bottom w:val="dashed" w:color="000000" w:sz="8"/>
+              <w:right w:val="dashed" w:color="000000" w:sz="8"/>
+            </w:tcBorders>
+            <w:tcMar>
+              <w:top w:type="dxa" w:w="80"/>
+              <w:left w:type="dxa" w:w="140"/>
+              <w:bottom w:type="dxa" w:w="80"/>
+              <w:right w:type="dxa" w:w="140"/>
+            </w:tcMar>
           </w:tcPr>
           <w:p>
             <w:r>
@@ -1982,1000 +2344,16 @@
                 <w:sz w:val="21"/>
                 <w:szCs w:val="21"/>
               </w:rPr>
-              <w:t xml:space="preserve">Feature</w:t>
-            </w:r>
-          </w:p>
-        </w:tc>
-        <w:tc>
-          <w:tcPr>
-            <w:tcW w:type="dxa" w:w="2700"/>
-            <w:tcBorders>
-              <w:top w:val="single" w:color="000000" w:sz="6"/>
-              <w:left w:val="single" w:color="000000" w:sz="6"/>
-              <w:bottom w:val="single" w:color="000000" w:sz="6"/>
-              <w:right w:val="single" w:color="000000" w:sz="6"/>
-            </w:tcBorders>
-            <w:tcMar>
-              <w:top w:type="dxa" w:w="90"/>
-              <w:left w:type="dxa" w:w="90"/>
-              <w:bottom w:type="dxa" w:w="90"/>
-              <w:right w:type="dxa" w:w="70"/>
-            </w:tcMar>
-            <w:vAlign w:val="center"/>
-          </w:tcPr>
-          <w:p>
-            <w:r>
-              <w:rPr>
-                <w:rFonts w:ascii="Arial" w:cs="Arial" w:eastAsia="Arial" w:hAnsi="Arial"/>
-                <w:b/>
-                <w:bCs/>
-                <w:color w:val="000000"/>
-                <w:sz w:val="21"/>
-                <w:szCs w:val="21"/>
-              </w:rPr>
-              <w:t xml:space="preserve">My choice</w:t>
-            </w:r>
-          </w:p>
-        </w:tc>
-        <w:tc>
-          <w:tcPr>
-            <w:tcW w:type="dxa" w:w="1000"/>
-            <w:tcBorders>
-              <w:top w:val="single" w:color="000000" w:sz="6"/>
-              <w:left w:val="single" w:color="000000" w:sz="6"/>
-              <w:bottom w:val="single" w:color="000000" w:sz="6"/>
-              <w:right w:val="single" w:color="000000" w:sz="6"/>
-            </w:tcBorders>
-            <w:tcMar>
-              <w:top w:type="dxa" w:w="90"/>
-              <w:left w:type="dxa" w:w="90"/>
-              <w:bottom w:type="dxa" w:w="90"/>
-              <w:right w:type="dxa" w:w="70"/>
-            </w:tcMar>
-            <w:vAlign w:val="center"/>
-          </w:tcPr>
-          <w:p>
-            <w:r>
-              <w:rPr>
-                <w:rFonts w:ascii="Arial" w:cs="Arial" w:eastAsia="Arial" w:hAnsi="Arial"/>
-                <w:b/>
-                <w:bCs/>
-                <w:color w:val="000000"/>
-                <w:sz w:val="21"/>
-                <w:szCs w:val="21"/>
-              </w:rPr>
-              <w:t xml:space="preserve">Coins</w:t>
-            </w:r>
-          </w:p>
-        </w:tc>
-        <w:tc>
-          <w:tcPr>
-            <w:tcW w:type="dxa" w:w="3906"/>
-            <w:tcBorders>
-              <w:top w:val="single" w:color="000000" w:sz="6"/>
-              <w:left w:val="single" w:color="000000" w:sz="6"/>
-              <w:bottom w:val="single" w:color="000000" w:sz="6"/>
-              <w:right w:val="single" w:color="000000" w:sz="6"/>
-            </w:tcBorders>
-            <w:tcMar>
-              <w:top w:type="dxa" w:w="90"/>
-              <w:left w:type="dxa" w:w="90"/>
-              <w:bottom w:type="dxa" w:w="90"/>
-              <w:right w:type="dxa" w:w="70"/>
-            </w:tcMar>
-            <w:vAlign w:val="center"/>
-          </w:tcPr>
-          <w:p>
-            <w:r>
-              <w:rPr>
-                <w:rFonts w:ascii="Arial" w:cs="Arial" w:eastAsia="Arial" w:hAnsi="Arial"/>
-                <w:b/>
-                <w:bCs/>
-                <w:color w:val="000000"/>
-                <w:sz w:val="21"/>
-                <w:szCs w:val="21"/>
-              </w:rPr>
-              <w:t xml:space="preserve">Why? I want ___ because ___.</w:t>
-            </w:r>
-          </w:p>
-        </w:tc>
-      </w:tr>
-      <w:tr>
-        <w:trPr>
-          <w:trHeight w:val="410" w:hRule="atLeast"/>
-        </w:trPr>
-        <w:tc>
-          <w:tcPr>
-            <w:tcW w:type="dxa" w:w="2300"/>
-            <w:tcBorders>
-              <w:top w:val="single" w:color="000000" w:sz="6"/>
-              <w:left w:val="single" w:color="000000" w:sz="6"/>
-              <w:bottom w:val="single" w:color="000000" w:sz="6"/>
-              <w:right w:val="single" w:color="000000" w:sz="6"/>
-            </w:tcBorders>
-            <w:tcMar>
-              <w:top w:type="dxa" w:w="90"/>
-              <w:left w:type="dxa" w:w="90"/>
-              <w:bottom w:type="dxa" w:w="90"/>
-              <w:right w:type="dxa" w:w="70"/>
-            </w:tcMar>
-            <w:vAlign w:val="center"/>
-          </w:tcPr>
-          <w:p>
-            <w:r>
-              <w:rPr>
-                <w:rFonts w:ascii="Arial" w:cs="Arial" w:eastAsia="Arial" w:hAnsi="Arial"/>
-                <w:b/>
-                <w:bCs/>
-                <w:color w:val="000000"/>
-                <w:sz w:val="21"/>
-                <w:szCs w:val="21"/>
-              </w:rPr>
-              <w:t xml:space="preserve">Bedrooms</w:t>
-            </w:r>
-          </w:p>
-        </w:tc>
-        <w:tc>
-          <w:tcPr>
-            <w:tcW w:type="dxa" w:w="2700"/>
-            <w:tcBorders>
-              <w:top w:val="single" w:color="000000" w:sz="6"/>
-              <w:left w:val="single" w:color="000000" w:sz="6"/>
-              <w:bottom w:val="single" w:color="000000" w:sz="6"/>
-              <w:right w:val="single" w:color="000000" w:sz="6"/>
-            </w:tcBorders>
-            <w:tcMar>
-              <w:top w:type="dxa" w:w="90"/>
-              <w:left w:type="dxa" w:w="90"/>
-              <w:bottom w:type="dxa" w:w="90"/>
-              <w:right w:type="dxa" w:w="70"/>
-            </w:tcMar>
-            <w:vAlign w:val="center"/>
-          </w:tcPr>
-          <w:p>
-            <w:r>
-              <w:rPr>
-                <w:rFonts w:ascii="Arial" w:cs="Arial" w:eastAsia="Arial" w:hAnsi="Arial"/>
-                <w:b w:val="false"/>
-                <w:bCs w:val="false"/>
-                <w:color w:val="000000"/>
-                <w:sz w:val="21"/>
-                <w:szCs w:val="21"/>
-              </w:rPr>
-              <w:t xml:space="preserve"/>
-            </w:r>
-          </w:p>
-        </w:tc>
-        <w:tc>
-          <w:tcPr>
-            <w:tcW w:type="dxa" w:w="1000"/>
-            <w:tcBorders>
-              <w:top w:val="single" w:color="000000" w:sz="6"/>
-              <w:left w:val="single" w:color="000000" w:sz="6"/>
-              <w:bottom w:val="single" w:color="000000" w:sz="6"/>
-              <w:right w:val="single" w:color="000000" w:sz="6"/>
-            </w:tcBorders>
-            <w:tcMar>
-              <w:top w:type="dxa" w:w="90"/>
-              <w:left w:type="dxa" w:w="90"/>
-              <w:bottom w:type="dxa" w:w="90"/>
-              <w:right w:type="dxa" w:w="70"/>
-            </w:tcMar>
-            <w:vAlign w:val="center"/>
-          </w:tcPr>
-          <w:p>
-            <w:r>
-              <w:rPr>
-                <w:rFonts w:ascii="Arial" w:cs="Arial" w:eastAsia="Arial" w:hAnsi="Arial"/>
-                <w:b w:val="false"/>
-                <w:bCs w:val="false"/>
-                <w:color w:val="000000"/>
-                <w:sz w:val="21"/>
-                <w:szCs w:val="21"/>
-              </w:rPr>
-              <w:t xml:space="preserve"/>
-            </w:r>
-          </w:p>
-        </w:tc>
-        <w:tc>
-          <w:tcPr>
-            <w:tcW w:type="dxa" w:w="3906"/>
-            <w:tcBorders>
-              <w:top w:val="single" w:color="000000" w:sz="6"/>
-              <w:left w:val="single" w:color="000000" w:sz="6"/>
-              <w:bottom w:val="single" w:color="000000" w:sz="6"/>
-              <w:right w:val="single" w:color="000000" w:sz="6"/>
-            </w:tcBorders>
-            <w:tcMar>
-              <w:top w:type="dxa" w:w="90"/>
-              <w:left w:type="dxa" w:w="90"/>
-              <w:bottom w:type="dxa" w:w="90"/>
-              <w:right w:type="dxa" w:w="70"/>
-            </w:tcMar>
-            <w:vAlign w:val="center"/>
-          </w:tcPr>
-          <w:p>
-            <w:r>
-              <w:rPr>
-                <w:rFonts w:ascii="Arial" w:cs="Arial" w:eastAsia="Arial" w:hAnsi="Arial"/>
-                <w:b w:val="false"/>
-                <w:bCs w:val="false"/>
-                <w:color w:val="000000"/>
-                <w:sz w:val="21"/>
-                <w:szCs w:val="21"/>
-              </w:rPr>
-              <w:t xml:space="preserve"/>
-            </w:r>
-          </w:p>
-        </w:tc>
-      </w:tr>
-      <w:tr>
-        <w:trPr>
-          <w:trHeight w:val="410" w:hRule="atLeast"/>
-        </w:trPr>
-        <w:tc>
-          <w:tcPr>
-            <w:tcW w:type="dxa" w:w="2300"/>
-            <w:tcBorders>
-              <w:top w:val="single" w:color="000000" w:sz="6"/>
-              <w:left w:val="single" w:color="000000" w:sz="6"/>
-              <w:bottom w:val="single" w:color="000000" w:sz="6"/>
-              <w:right w:val="single" w:color="000000" w:sz="6"/>
-            </w:tcBorders>
-            <w:tcMar>
-              <w:top w:type="dxa" w:w="90"/>
-              <w:left w:type="dxa" w:w="90"/>
-              <w:bottom w:type="dxa" w:w="90"/>
-              <w:right w:type="dxa" w:w="70"/>
-            </w:tcMar>
-            <w:vAlign w:val="center"/>
-          </w:tcPr>
-          <w:p>
-            <w:r>
-              <w:rPr>
-                <w:rFonts w:ascii="Arial" w:cs="Arial" w:eastAsia="Arial" w:hAnsi="Arial"/>
-                <w:b/>
-                <w:bCs/>
-                <w:color w:val="000000"/>
-                <w:sz w:val="21"/>
-                <w:szCs w:val="21"/>
-              </w:rPr>
-              <w:t xml:space="preserve">Bathrooms</w:t>
-            </w:r>
-          </w:p>
-        </w:tc>
-        <w:tc>
-          <w:tcPr>
-            <w:tcW w:type="dxa" w:w="2700"/>
-            <w:tcBorders>
-              <w:top w:val="single" w:color="000000" w:sz="6"/>
-              <w:left w:val="single" w:color="000000" w:sz="6"/>
-              <w:bottom w:val="single" w:color="000000" w:sz="6"/>
-              <w:right w:val="single" w:color="000000" w:sz="6"/>
-            </w:tcBorders>
-            <w:tcMar>
-              <w:top w:type="dxa" w:w="90"/>
-              <w:left w:type="dxa" w:w="90"/>
-              <w:bottom w:type="dxa" w:w="90"/>
-              <w:right w:type="dxa" w:w="70"/>
-            </w:tcMar>
-            <w:vAlign w:val="center"/>
-          </w:tcPr>
-          <w:p>
-            <w:r>
-              <w:rPr>
-                <w:rFonts w:ascii="Arial" w:cs="Arial" w:eastAsia="Arial" w:hAnsi="Arial"/>
-                <w:b w:val="false"/>
-                <w:bCs w:val="false"/>
-                <w:color w:val="000000"/>
-                <w:sz w:val="21"/>
-                <w:szCs w:val="21"/>
-              </w:rPr>
-              <w:t xml:space="preserve"/>
-            </w:r>
-          </w:p>
-        </w:tc>
-        <w:tc>
-          <w:tcPr>
-            <w:tcW w:type="dxa" w:w="1000"/>
-            <w:tcBorders>
-              <w:top w:val="single" w:color="000000" w:sz="6"/>
-              <w:left w:val="single" w:color="000000" w:sz="6"/>
-              <w:bottom w:val="single" w:color="000000" w:sz="6"/>
-              <w:right w:val="single" w:color="000000" w:sz="6"/>
-            </w:tcBorders>
-            <w:tcMar>
-              <w:top w:type="dxa" w:w="90"/>
-              <w:left w:type="dxa" w:w="90"/>
-              <w:bottom w:type="dxa" w:w="90"/>
-              <w:right w:type="dxa" w:w="70"/>
-            </w:tcMar>
-            <w:vAlign w:val="center"/>
-          </w:tcPr>
-          <w:p>
-            <w:r>
-              <w:rPr>
-                <w:rFonts w:ascii="Arial" w:cs="Arial" w:eastAsia="Arial" w:hAnsi="Arial"/>
-                <w:b w:val="false"/>
-                <w:bCs w:val="false"/>
-                <w:color w:val="000000"/>
-                <w:sz w:val="21"/>
-                <w:szCs w:val="21"/>
-              </w:rPr>
-              <w:t xml:space="preserve"/>
-            </w:r>
-          </w:p>
-        </w:tc>
-        <w:tc>
-          <w:tcPr>
-            <w:tcW w:type="dxa" w:w="3906"/>
-            <w:tcBorders>
-              <w:top w:val="single" w:color="000000" w:sz="6"/>
-              <w:left w:val="single" w:color="000000" w:sz="6"/>
-              <w:bottom w:val="single" w:color="000000" w:sz="6"/>
-              <w:right w:val="single" w:color="000000" w:sz="6"/>
-            </w:tcBorders>
-            <w:tcMar>
-              <w:top w:type="dxa" w:w="90"/>
-              <w:left w:type="dxa" w:w="90"/>
-              <w:bottom w:type="dxa" w:w="90"/>
-              <w:right w:type="dxa" w:w="70"/>
-            </w:tcMar>
-            <w:vAlign w:val="center"/>
-          </w:tcPr>
-          <w:p>
-            <w:r>
-              <w:rPr>
-                <w:rFonts w:ascii="Arial" w:cs="Arial" w:eastAsia="Arial" w:hAnsi="Arial"/>
-                <w:b w:val="false"/>
-                <w:bCs w:val="false"/>
-                <w:color w:val="000000"/>
-                <w:sz w:val="21"/>
-                <w:szCs w:val="21"/>
-              </w:rPr>
-              <w:t xml:space="preserve"/>
-            </w:r>
-          </w:p>
-        </w:tc>
-      </w:tr>
-      <w:tr>
-        <w:trPr>
-          <w:trHeight w:val="410" w:hRule="atLeast"/>
-        </w:trPr>
-        <w:tc>
-          <w:tcPr>
-            <w:tcW w:type="dxa" w:w="2300"/>
-            <w:tcBorders>
-              <w:top w:val="single" w:color="000000" w:sz="6"/>
-              <w:left w:val="single" w:color="000000" w:sz="6"/>
-              <w:bottom w:val="single" w:color="000000" w:sz="6"/>
-              <w:right w:val="single" w:color="000000" w:sz="6"/>
-            </w:tcBorders>
-            <w:tcMar>
-              <w:top w:type="dxa" w:w="90"/>
-              <w:left w:type="dxa" w:w="90"/>
-              <w:bottom w:type="dxa" w:w="90"/>
-              <w:right w:type="dxa" w:w="70"/>
-            </w:tcMar>
-            <w:vAlign w:val="center"/>
-          </w:tcPr>
-          <w:p>
-            <w:r>
-              <w:rPr>
-                <w:rFonts w:ascii="Arial" w:cs="Arial" w:eastAsia="Arial" w:hAnsi="Arial"/>
-                <w:b/>
-                <w:bCs/>
-                <w:color w:val="000000"/>
-                <w:sz w:val="21"/>
-                <w:szCs w:val="21"/>
-              </w:rPr>
-              <w:t xml:space="preserve">Kitchen</w:t>
-            </w:r>
-          </w:p>
-        </w:tc>
-        <w:tc>
-          <w:tcPr>
-            <w:tcW w:type="dxa" w:w="2700"/>
-            <w:tcBorders>
-              <w:top w:val="single" w:color="000000" w:sz="6"/>
-              <w:left w:val="single" w:color="000000" w:sz="6"/>
-              <w:bottom w:val="single" w:color="000000" w:sz="6"/>
-              <w:right w:val="single" w:color="000000" w:sz="6"/>
-            </w:tcBorders>
-            <w:tcMar>
-              <w:top w:type="dxa" w:w="90"/>
-              <w:left w:type="dxa" w:w="90"/>
-              <w:bottom w:type="dxa" w:w="90"/>
-              <w:right w:type="dxa" w:w="70"/>
-            </w:tcMar>
-            <w:vAlign w:val="center"/>
-          </w:tcPr>
-          <w:p>
-            <w:r>
-              <w:rPr>
-                <w:rFonts w:ascii="Arial" w:cs="Arial" w:eastAsia="Arial" w:hAnsi="Arial"/>
-                <w:b w:val="false"/>
-                <w:bCs w:val="false"/>
-                <w:color w:val="000000"/>
-                <w:sz w:val="21"/>
-                <w:szCs w:val="21"/>
-              </w:rPr>
-              <w:t xml:space="preserve"/>
-            </w:r>
-          </w:p>
-        </w:tc>
-        <w:tc>
-          <w:tcPr>
-            <w:tcW w:type="dxa" w:w="1000"/>
-            <w:tcBorders>
-              <w:top w:val="single" w:color="000000" w:sz="6"/>
-              <w:left w:val="single" w:color="000000" w:sz="6"/>
-              <w:bottom w:val="single" w:color="000000" w:sz="6"/>
-              <w:right w:val="single" w:color="000000" w:sz="6"/>
-            </w:tcBorders>
-            <w:tcMar>
-              <w:top w:type="dxa" w:w="90"/>
-              <w:left w:type="dxa" w:w="90"/>
-              <w:bottom w:type="dxa" w:w="90"/>
-              <w:right w:type="dxa" w:w="70"/>
-            </w:tcMar>
-            <w:vAlign w:val="center"/>
-          </w:tcPr>
-          <w:p>
-            <w:r>
-              <w:rPr>
-                <w:rFonts w:ascii="Arial" w:cs="Arial" w:eastAsia="Arial" w:hAnsi="Arial"/>
-                <w:b w:val="false"/>
-                <w:bCs w:val="false"/>
-                <w:color w:val="000000"/>
-                <w:sz w:val="21"/>
-                <w:szCs w:val="21"/>
-              </w:rPr>
-              <w:t xml:space="preserve"/>
-            </w:r>
-          </w:p>
-        </w:tc>
-        <w:tc>
-          <w:tcPr>
-            <w:tcW w:type="dxa" w:w="3906"/>
-            <w:tcBorders>
-              <w:top w:val="single" w:color="000000" w:sz="6"/>
-              <w:left w:val="single" w:color="000000" w:sz="6"/>
-              <w:bottom w:val="single" w:color="000000" w:sz="6"/>
-              <w:right w:val="single" w:color="000000" w:sz="6"/>
-            </w:tcBorders>
-            <w:tcMar>
-              <w:top w:type="dxa" w:w="90"/>
-              <w:left w:type="dxa" w:w="90"/>
-              <w:bottom w:type="dxa" w:w="90"/>
-              <w:right w:type="dxa" w:w="70"/>
-            </w:tcMar>
-            <w:vAlign w:val="center"/>
-          </w:tcPr>
-          <w:p>
-            <w:r>
-              <w:rPr>
-                <w:rFonts w:ascii="Arial" w:cs="Arial" w:eastAsia="Arial" w:hAnsi="Arial"/>
-                <w:b w:val="false"/>
-                <w:bCs w:val="false"/>
-                <w:color w:val="000000"/>
-                <w:sz w:val="21"/>
-                <w:szCs w:val="21"/>
-              </w:rPr>
-              <w:t xml:space="preserve"/>
-            </w:r>
-          </w:p>
-        </w:tc>
-      </w:tr>
-      <w:tr>
-        <w:trPr>
-          <w:trHeight w:val="410" w:hRule="atLeast"/>
-        </w:trPr>
-        <w:tc>
-          <w:tcPr>
-            <w:tcW w:type="dxa" w:w="2300"/>
-            <w:tcBorders>
-              <w:top w:val="single" w:color="000000" w:sz="6"/>
-              <w:left w:val="single" w:color="000000" w:sz="6"/>
-              <w:bottom w:val="single" w:color="000000" w:sz="6"/>
-              <w:right w:val="single" w:color="000000" w:sz="6"/>
-            </w:tcBorders>
-            <w:tcMar>
-              <w:top w:type="dxa" w:w="90"/>
-              <w:left w:type="dxa" w:w="90"/>
-              <w:bottom w:type="dxa" w:w="90"/>
-              <w:right w:type="dxa" w:w="70"/>
-            </w:tcMar>
-            <w:vAlign w:val="center"/>
-          </w:tcPr>
-          <w:p>
-            <w:r>
-              <w:rPr>
-                <w:rFonts w:ascii="Arial" w:cs="Arial" w:eastAsia="Arial" w:hAnsi="Arial"/>
-                <w:b/>
-                <w:bCs/>
-                <w:color w:val="000000"/>
-                <w:sz w:val="21"/>
-                <w:szCs w:val="21"/>
-              </w:rPr>
-              <w:t xml:space="preserve">Extra 1</w:t>
-            </w:r>
-          </w:p>
-        </w:tc>
-        <w:tc>
-          <w:tcPr>
-            <w:tcW w:type="dxa" w:w="2700"/>
-            <w:tcBorders>
-              <w:top w:val="single" w:color="000000" w:sz="6"/>
-              <w:left w:val="single" w:color="000000" w:sz="6"/>
-              <w:bottom w:val="single" w:color="000000" w:sz="6"/>
-              <w:right w:val="single" w:color="000000" w:sz="6"/>
-            </w:tcBorders>
-            <w:tcMar>
-              <w:top w:type="dxa" w:w="90"/>
-              <w:left w:type="dxa" w:w="90"/>
-              <w:bottom w:type="dxa" w:w="90"/>
-              <w:right w:type="dxa" w:w="70"/>
-            </w:tcMar>
-            <w:vAlign w:val="center"/>
-          </w:tcPr>
-          <w:p>
-            <w:r>
-              <w:rPr>
-                <w:rFonts w:ascii="Arial" w:cs="Arial" w:eastAsia="Arial" w:hAnsi="Arial"/>
-                <w:b w:val="false"/>
-                <w:bCs w:val="false"/>
-                <w:color w:val="000000"/>
-                <w:sz w:val="21"/>
-                <w:szCs w:val="21"/>
-              </w:rPr>
-              <w:t xml:space="preserve"/>
-            </w:r>
-          </w:p>
-        </w:tc>
-        <w:tc>
-          <w:tcPr>
-            <w:tcW w:type="dxa" w:w="1000"/>
-            <w:tcBorders>
-              <w:top w:val="single" w:color="000000" w:sz="6"/>
-              <w:left w:val="single" w:color="000000" w:sz="6"/>
-              <w:bottom w:val="single" w:color="000000" w:sz="6"/>
-              <w:right w:val="single" w:color="000000" w:sz="6"/>
-            </w:tcBorders>
-            <w:tcMar>
-              <w:top w:type="dxa" w:w="90"/>
-              <w:left w:type="dxa" w:w="90"/>
-              <w:bottom w:type="dxa" w:w="90"/>
-              <w:right w:type="dxa" w:w="70"/>
-            </w:tcMar>
-            <w:vAlign w:val="center"/>
-          </w:tcPr>
-          <w:p>
-            <w:r>
-              <w:rPr>
-                <w:rFonts w:ascii="Arial" w:cs="Arial" w:eastAsia="Arial" w:hAnsi="Arial"/>
-                <w:b w:val="false"/>
-                <w:bCs w:val="false"/>
-                <w:color w:val="000000"/>
-                <w:sz w:val="21"/>
-                <w:szCs w:val="21"/>
-              </w:rPr>
-              <w:t xml:space="preserve"/>
-            </w:r>
-          </w:p>
-        </w:tc>
-        <w:tc>
-          <w:tcPr>
-            <w:tcW w:type="dxa" w:w="3906"/>
-            <w:tcBorders>
-              <w:top w:val="single" w:color="000000" w:sz="6"/>
-              <w:left w:val="single" w:color="000000" w:sz="6"/>
-              <w:bottom w:val="single" w:color="000000" w:sz="6"/>
-              <w:right w:val="single" w:color="000000" w:sz="6"/>
-            </w:tcBorders>
-            <w:tcMar>
-              <w:top w:type="dxa" w:w="90"/>
-              <w:left w:type="dxa" w:w="90"/>
-              <w:bottom w:type="dxa" w:w="90"/>
-              <w:right w:type="dxa" w:w="70"/>
-            </w:tcMar>
-            <w:vAlign w:val="center"/>
-          </w:tcPr>
-          <w:p>
-            <w:r>
-              <w:rPr>
-                <w:rFonts w:ascii="Arial" w:cs="Arial" w:eastAsia="Arial" w:hAnsi="Arial"/>
-                <w:b w:val="false"/>
-                <w:bCs w:val="false"/>
-                <w:color w:val="000000"/>
-                <w:sz w:val="21"/>
-                <w:szCs w:val="21"/>
-              </w:rPr>
-              <w:t xml:space="preserve"/>
-            </w:r>
-          </w:p>
-        </w:tc>
-      </w:tr>
-      <w:tr>
-        <w:trPr>
-          <w:trHeight w:val="410" w:hRule="atLeast"/>
-        </w:trPr>
-        <w:tc>
-          <w:tcPr>
-            <w:tcW w:type="dxa" w:w="2300"/>
-            <w:tcBorders>
-              <w:top w:val="single" w:color="000000" w:sz="6"/>
-              <w:left w:val="single" w:color="000000" w:sz="6"/>
-              <w:bottom w:val="single" w:color="000000" w:sz="6"/>
-              <w:right w:val="single" w:color="000000" w:sz="6"/>
-            </w:tcBorders>
-            <w:tcMar>
-              <w:top w:type="dxa" w:w="90"/>
-              <w:left w:type="dxa" w:w="90"/>
-              <w:bottom w:type="dxa" w:w="90"/>
-              <w:right w:type="dxa" w:w="70"/>
-            </w:tcMar>
-            <w:vAlign w:val="center"/>
-          </w:tcPr>
-          <w:p>
-            <w:r>
-              <w:rPr>
-                <w:rFonts w:ascii="Arial" w:cs="Arial" w:eastAsia="Arial" w:hAnsi="Arial"/>
-                <w:b/>
-                <w:bCs/>
-                <w:color w:val="000000"/>
-                <w:sz w:val="21"/>
-                <w:szCs w:val="21"/>
-              </w:rPr>
-              <w:t xml:space="preserve">Extra 2</w:t>
-            </w:r>
-          </w:p>
-        </w:tc>
-        <w:tc>
-          <w:tcPr>
-            <w:tcW w:type="dxa" w:w="2700"/>
-            <w:tcBorders>
-              <w:top w:val="single" w:color="000000" w:sz="6"/>
-              <w:left w:val="single" w:color="000000" w:sz="6"/>
-              <w:bottom w:val="single" w:color="000000" w:sz="6"/>
-              <w:right w:val="single" w:color="000000" w:sz="6"/>
-            </w:tcBorders>
-            <w:tcMar>
-              <w:top w:type="dxa" w:w="90"/>
-              <w:left w:type="dxa" w:w="90"/>
-              <w:bottom w:type="dxa" w:w="90"/>
-              <w:right w:type="dxa" w:w="70"/>
-            </w:tcMar>
-            <w:vAlign w:val="center"/>
-          </w:tcPr>
-          <w:p>
-            <w:r>
-              <w:rPr>
-                <w:rFonts w:ascii="Arial" w:cs="Arial" w:eastAsia="Arial" w:hAnsi="Arial"/>
-                <w:b w:val="false"/>
-                <w:bCs w:val="false"/>
-                <w:color w:val="000000"/>
-                <w:sz w:val="21"/>
-                <w:szCs w:val="21"/>
-              </w:rPr>
-              <w:t xml:space="preserve"/>
-            </w:r>
-          </w:p>
-        </w:tc>
-        <w:tc>
-          <w:tcPr>
-            <w:tcW w:type="dxa" w:w="1000"/>
-            <w:tcBorders>
-              <w:top w:val="single" w:color="000000" w:sz="6"/>
-              <w:left w:val="single" w:color="000000" w:sz="6"/>
-              <w:bottom w:val="single" w:color="000000" w:sz="6"/>
-              <w:right w:val="single" w:color="000000" w:sz="6"/>
-            </w:tcBorders>
-            <w:tcMar>
-              <w:top w:type="dxa" w:w="90"/>
-              <w:left w:type="dxa" w:w="90"/>
-              <w:bottom w:type="dxa" w:w="90"/>
-              <w:right w:type="dxa" w:w="70"/>
-            </w:tcMar>
-            <w:vAlign w:val="center"/>
-          </w:tcPr>
-          <w:p>
-            <w:r>
-              <w:rPr>
-                <w:rFonts w:ascii="Arial" w:cs="Arial" w:eastAsia="Arial" w:hAnsi="Arial"/>
-                <w:b w:val="false"/>
-                <w:bCs w:val="false"/>
-                <w:color w:val="000000"/>
-                <w:sz w:val="21"/>
-                <w:szCs w:val="21"/>
-              </w:rPr>
-              <w:t xml:space="preserve"/>
-            </w:r>
-          </w:p>
-        </w:tc>
-        <w:tc>
-          <w:tcPr>
-            <w:tcW w:type="dxa" w:w="3906"/>
-            <w:tcBorders>
-              <w:top w:val="single" w:color="000000" w:sz="6"/>
-              <w:left w:val="single" w:color="000000" w:sz="6"/>
-              <w:bottom w:val="single" w:color="000000" w:sz="6"/>
-              <w:right w:val="single" w:color="000000" w:sz="6"/>
-            </w:tcBorders>
-            <w:tcMar>
-              <w:top w:type="dxa" w:w="90"/>
-              <w:left w:type="dxa" w:w="90"/>
-              <w:bottom w:type="dxa" w:w="90"/>
-              <w:right w:type="dxa" w:w="70"/>
-            </w:tcMar>
-            <w:vAlign w:val="center"/>
-          </w:tcPr>
-          <w:p>
-            <w:r>
-              <w:rPr>
-                <w:rFonts w:ascii="Arial" w:cs="Arial" w:eastAsia="Arial" w:hAnsi="Arial"/>
-                <w:b w:val="false"/>
-                <w:bCs w:val="false"/>
-                <w:color w:val="000000"/>
-                <w:sz w:val="21"/>
-                <w:szCs w:val="21"/>
-              </w:rPr>
-              <w:t xml:space="preserve"/>
-            </w:r>
-          </w:p>
-        </w:tc>
-      </w:tr>
-      <w:tr>
-        <w:trPr>
-          <w:trHeight w:val="410" w:hRule="atLeast"/>
-        </w:trPr>
-        <w:tc>
-          <w:tcPr>
-            <w:tcW w:type="dxa" w:w="2300"/>
-            <w:tcBorders>
-              <w:top w:val="single" w:color="000000" w:sz="6"/>
-              <w:left w:val="single" w:color="000000" w:sz="6"/>
-              <w:bottom w:val="single" w:color="000000" w:sz="6"/>
-              <w:right w:val="single" w:color="000000" w:sz="6"/>
-            </w:tcBorders>
-            <w:tcMar>
-              <w:top w:type="dxa" w:w="90"/>
-              <w:left w:type="dxa" w:w="90"/>
-              <w:bottom w:type="dxa" w:w="90"/>
-              <w:right w:type="dxa" w:w="70"/>
-            </w:tcMar>
-            <w:vAlign w:val="center"/>
-          </w:tcPr>
-          <w:p>
-            <w:r>
-              <w:rPr>
-                <w:rFonts w:ascii="Arial" w:cs="Arial" w:eastAsia="Arial" w:hAnsi="Arial"/>
-                <w:b/>
-                <w:bCs/>
-                <w:color w:val="000000"/>
-                <w:sz w:val="21"/>
-                <w:szCs w:val="21"/>
-              </w:rPr>
-              <w:t xml:space="preserve">Extra 3</w:t>
-            </w:r>
-          </w:p>
-        </w:tc>
-        <w:tc>
-          <w:tcPr>
-            <w:tcW w:type="dxa" w:w="2700"/>
-            <w:tcBorders>
-              <w:top w:val="single" w:color="000000" w:sz="6"/>
-              <w:left w:val="single" w:color="000000" w:sz="6"/>
-              <w:bottom w:val="single" w:color="000000" w:sz="6"/>
-              <w:right w:val="single" w:color="000000" w:sz="6"/>
-            </w:tcBorders>
-            <w:tcMar>
-              <w:top w:type="dxa" w:w="90"/>
-              <w:left w:type="dxa" w:w="90"/>
-              <w:bottom w:type="dxa" w:w="90"/>
-              <w:right w:type="dxa" w:w="70"/>
-            </w:tcMar>
-            <w:vAlign w:val="center"/>
-          </w:tcPr>
-          <w:p>
-            <w:r>
-              <w:rPr>
-                <w:rFonts w:ascii="Arial" w:cs="Arial" w:eastAsia="Arial" w:hAnsi="Arial"/>
-                <w:b w:val="false"/>
-                <w:bCs w:val="false"/>
-                <w:color w:val="000000"/>
-                <w:sz w:val="21"/>
-                <w:szCs w:val="21"/>
-              </w:rPr>
-              <w:t xml:space="preserve"/>
-            </w:r>
-          </w:p>
-        </w:tc>
-        <w:tc>
-          <w:tcPr>
-            <w:tcW w:type="dxa" w:w="1000"/>
-            <w:tcBorders>
-              <w:top w:val="single" w:color="000000" w:sz="6"/>
-              <w:left w:val="single" w:color="000000" w:sz="6"/>
-              <w:bottom w:val="single" w:color="000000" w:sz="6"/>
-              <w:right w:val="single" w:color="000000" w:sz="6"/>
-            </w:tcBorders>
-            <w:tcMar>
-              <w:top w:type="dxa" w:w="90"/>
-              <w:left w:type="dxa" w:w="90"/>
-              <w:bottom w:type="dxa" w:w="90"/>
-              <w:right w:type="dxa" w:w="70"/>
-            </w:tcMar>
-            <w:vAlign w:val="center"/>
-          </w:tcPr>
-          <w:p>
-            <w:r>
-              <w:rPr>
-                <w:rFonts w:ascii="Arial" w:cs="Arial" w:eastAsia="Arial" w:hAnsi="Arial"/>
-                <w:b w:val="false"/>
-                <w:bCs w:val="false"/>
-                <w:color w:val="000000"/>
-                <w:sz w:val="21"/>
-                <w:szCs w:val="21"/>
-              </w:rPr>
-              <w:t xml:space="preserve"/>
-            </w:r>
-          </w:p>
-        </w:tc>
-        <w:tc>
-          <w:tcPr>
-            <w:tcW w:type="dxa" w:w="3906"/>
-            <w:tcBorders>
-              <w:top w:val="single" w:color="000000" w:sz="6"/>
-              <w:left w:val="single" w:color="000000" w:sz="6"/>
-              <w:bottom w:val="single" w:color="000000" w:sz="6"/>
-              <w:right w:val="single" w:color="000000" w:sz="6"/>
-            </w:tcBorders>
-            <w:tcMar>
-              <w:top w:type="dxa" w:w="90"/>
-              <w:left w:type="dxa" w:w="90"/>
-              <w:bottom w:type="dxa" w:w="90"/>
-              <w:right w:type="dxa" w:w="70"/>
-            </w:tcMar>
-            <w:vAlign w:val="center"/>
-          </w:tcPr>
-          <w:p>
-            <w:r>
-              <w:rPr>
-                <w:rFonts w:ascii="Arial" w:cs="Arial" w:eastAsia="Arial" w:hAnsi="Arial"/>
-                <w:b w:val="false"/>
-                <w:bCs w:val="false"/>
-                <w:color w:val="000000"/>
-                <w:sz w:val="21"/>
-                <w:szCs w:val="21"/>
-              </w:rPr>
-              <w:t xml:space="preserve"/>
-            </w:r>
-          </w:p>
-        </w:tc>
-      </w:tr>
-      <w:tr>
-        <w:tc>
-          <w:tcPr>
-            <w:tcW w:type="dxa" w:w="2300"/>
-            <w:tcBorders>
-              <w:top w:val="single" w:color="000000" w:sz="6"/>
-              <w:left w:val="single" w:color="000000" w:sz="6"/>
-              <w:bottom w:val="single" w:color="000000" w:sz="6"/>
-              <w:right w:val="single" w:color="000000" w:sz="6"/>
-            </w:tcBorders>
-            <w:tcMar>
-              <w:top w:type="dxa" w:w="90"/>
-              <w:left w:type="dxa" w:w="90"/>
-              <w:bottom w:type="dxa" w:w="90"/>
-              <w:right w:type="dxa" w:w="70"/>
-            </w:tcMar>
-            <w:vAlign w:val="center"/>
-          </w:tcPr>
-          <w:p>
-            <w:r>
-              <w:rPr>
-                <w:rFonts w:ascii="Arial" w:cs="Arial" w:eastAsia="Arial" w:hAnsi="Arial"/>
-                <w:b/>
-                <w:bCs/>
-                <w:color w:val="000000"/>
-                <w:sz w:val="21"/>
-                <w:szCs w:val="21"/>
-              </w:rPr>
-              <w:t xml:space="preserve">Total coins used</w:t>
-            </w:r>
-          </w:p>
-        </w:tc>
-        <w:tc>
-          <w:tcPr>
-            <w:tcW w:type="dxa" w:w="2700"/>
-            <w:tcBorders>
-              <w:top w:val="single" w:color="000000" w:sz="6"/>
-              <w:left w:val="single" w:color="000000" w:sz="6"/>
-              <w:bottom w:val="single" w:color="000000" w:sz="6"/>
-              <w:right w:val="single" w:color="000000" w:sz="6"/>
-            </w:tcBorders>
-            <w:tcMar>
-              <w:top w:type="dxa" w:w="90"/>
-              <w:left w:type="dxa" w:w="90"/>
-              <w:bottom w:type="dxa" w:w="90"/>
-              <w:right w:type="dxa" w:w="70"/>
-            </w:tcMar>
-            <w:vAlign w:val="center"/>
-          </w:tcPr>
-          <w:p>
-            <w:r>
-              <w:rPr>
-                <w:rFonts w:ascii="Arial" w:cs="Arial" w:eastAsia="Arial" w:hAnsi="Arial"/>
-                <w:b/>
-                <w:bCs/>
-                <w:color w:val="000000"/>
-                <w:sz w:val="21"/>
-                <w:szCs w:val="21"/>
-              </w:rPr>
-              <w:t xml:space="preserve"/>
-            </w:r>
-          </w:p>
-        </w:tc>
-        <w:tc>
-          <w:tcPr>
-            <w:tcW w:type="dxa" w:w="1000"/>
-            <w:tcBorders>
-              <w:top w:val="single" w:color="000000" w:sz="6"/>
-              <w:left w:val="single" w:color="000000" w:sz="6"/>
-              <w:bottom w:val="single" w:color="000000" w:sz="6"/>
-              <w:right w:val="single" w:color="000000" w:sz="6"/>
-            </w:tcBorders>
-            <w:tcMar>
-              <w:top w:type="dxa" w:w="90"/>
-              <w:left w:type="dxa" w:w="90"/>
-              <w:bottom w:type="dxa" w:w="90"/>
-              <w:right w:type="dxa" w:w="70"/>
-            </w:tcMar>
-            <w:vAlign w:val="center"/>
-          </w:tcPr>
-          <w:p>
-            <w:r>
-              <w:rPr>
-                <w:rFonts w:ascii="Arial" w:cs="Arial" w:eastAsia="Arial" w:hAnsi="Arial"/>
-                <w:b/>
-                <w:bCs/>
-                <w:color w:val="000000"/>
-                <w:sz w:val="21"/>
-                <w:szCs w:val="21"/>
-              </w:rPr>
-              <w:t xml:space="preserve"/>
-            </w:r>
-          </w:p>
-        </w:tc>
-        <w:tc>
-          <w:tcPr>
-            <w:tcW w:type="dxa" w:w="3906"/>
-            <w:tcBorders>
-              <w:top w:val="single" w:color="000000" w:sz="6"/>
-              <w:left w:val="single" w:color="000000" w:sz="6"/>
-              <w:bottom w:val="single" w:color="000000" w:sz="6"/>
-              <w:right w:val="single" w:color="000000" w:sz="6"/>
-            </w:tcBorders>
-            <w:tcMar>
-              <w:top w:type="dxa" w:w="90"/>
-              <w:left w:type="dxa" w:w="90"/>
-              <w:bottom w:type="dxa" w:w="90"/>
-              <w:right w:type="dxa" w:w="70"/>
-            </w:tcMar>
-            <w:vAlign w:val="center"/>
-          </w:tcPr>
-          <w:p>
-            <w:r>
-              <w:rPr>
-                <w:rFonts w:ascii="Arial" w:cs="Arial" w:eastAsia="Arial" w:hAnsi="Arial"/>
-                <w:b/>
-                <w:bCs/>
-                <w:color w:val="000000"/>
-                <w:sz w:val="21"/>
-                <w:szCs w:val="21"/>
-              </w:rPr>
-              <w:t xml:space="preserve">____ / 10</w:t>
+              <w:t xml:space="preserve">Sentence starters:  </w:t>
+            </w:r>
+            <w:r>
+              <w:rPr>
+                <w:rFonts w:ascii="Arial" w:cs="Arial" w:eastAsia="Arial" w:hAnsi="Arial"/>
+                <w:color w:val="000000"/>
+                <w:sz w:val="21"/>
+                <w:szCs w:val="21"/>
+              </w:rPr>
+              <w:t xml:space="preserve">This is my dream home.  ·  It has ... bedrooms and ... bathrooms.  ·  It has a ... kitchen.  ·  It also has ...  ·  My favorite room is the ... because ...  ·  I like my home because ...</w:t>
             </w:r>
           </w:p>
         </w:tc>
@@ -2983,7 +2361,12 @@
     </w:tbl>
     <w:p>
       <w:pPr>
-        <w:spacing w:after="80" w:before="60"/>
+        <w:spacing w:after="100"/>
+      </w:pPr>
+    </w:p>
+    <w:p>
+      <w:pPr>
+        <w:spacing w:after="300"/>
       </w:pPr>
       <w:r>
         <w:rPr>
@@ -2994,12 +2377,21 @@
           <w:sz w:val="22"/>
           <w:szCs w:val="22"/>
         </w:rPr>
-        <w:t xml:space="preserve">Write about your perfect home. Write 6 sentences.</w:t>
+        <w:t xml:space="preserve">1.  </w:t>
+      </w:r>
+      <w:r>
+        <w:rPr>
+          <w:rFonts w:ascii="Arial" w:cs="Arial" w:eastAsia="Arial" w:hAnsi="Arial"/>
+          <w:color w:val="000000"/>
+          <w:sz w:val="22"/>
+          <w:szCs w:val="22"/>
+        </w:rPr>
+        <w:t xml:space="preserve">__________________________________________________________________</w:t>
       </w:r>
     </w:p>
     <w:p>
       <w:pPr>
-        <w:spacing w:after="90"/>
+        <w:spacing w:after="300"/>
       </w:pPr>
       <w:r>
         <w:rPr>
@@ -3010,7 +2402,7 @@
           <w:sz w:val="22"/>
           <w:szCs w:val="22"/>
         </w:rPr>
-        <w:t xml:space="preserve">1.  </w:t>
+        <w:t xml:space="preserve">2.  </w:t>
       </w:r>
       <w:r>
         <w:rPr>
@@ -3024,7 +2416,7 @@
     </w:p>
     <w:p>
       <w:pPr>
-        <w:spacing w:after="90"/>
+        <w:spacing w:after="300"/>
       </w:pPr>
       <w:r>
         <w:rPr>
@@ -3035,7 +2427,7 @@
           <w:sz w:val="22"/>
           <w:szCs w:val="22"/>
         </w:rPr>
-        <w:t xml:space="preserve">2.  </w:t>
+        <w:t xml:space="preserve">3.  </w:t>
       </w:r>
       <w:r>
         <w:rPr>
@@ -3049,7 +2441,7 @@
     </w:p>
     <w:p>
       <w:pPr>
-        <w:spacing w:after="90"/>
+        <w:spacing w:after="300"/>
       </w:pPr>
       <w:r>
         <w:rPr>
@@ -3060,7 +2452,7 @@
           <w:sz w:val="22"/>
           <w:szCs w:val="22"/>
         </w:rPr>
-        <w:t xml:space="preserve">3.  </w:t>
+        <w:t xml:space="preserve">4.  </w:t>
       </w:r>
       <w:r>
         <w:rPr>
@@ -3074,7 +2466,7 @@
     </w:p>
     <w:p>
       <w:pPr>
-        <w:spacing w:after="90"/>
+        <w:spacing w:after="300"/>
       </w:pPr>
       <w:r>
         <w:rPr>
@@ -3085,7 +2477,7 @@
           <w:sz w:val="22"/>
           <w:szCs w:val="22"/>
         </w:rPr>
-        <w:t xml:space="preserve">4.  </w:t>
+        <w:t xml:space="preserve">5.  </w:t>
       </w:r>
       <w:r>
         <w:rPr>
@@ -3099,32 +2491,7 @@
     </w:p>
     <w:p>
       <w:pPr>
-        <w:spacing w:after="90"/>
-      </w:pPr>
-      <w:r>
-        <w:rPr>
-          <w:rFonts w:ascii="Arial" w:cs="Arial" w:eastAsia="Arial" w:hAnsi="Arial"/>
-          <w:b/>
-          <w:bCs/>
-          <w:color w:val="000000"/>
-          <w:sz w:val="22"/>
-          <w:szCs w:val="22"/>
-        </w:rPr>
-        <w:t xml:space="preserve">5.  </w:t>
-      </w:r>
-      <w:r>
-        <w:rPr>
-          <w:rFonts w:ascii="Arial" w:cs="Arial" w:eastAsia="Arial" w:hAnsi="Arial"/>
-          <w:color w:val="000000"/>
-          <w:sz w:val="22"/>
-          <w:szCs w:val="22"/>
-        </w:rPr>
-        <w:t xml:space="preserve">__________________________________________________________________</w:t>
-      </w:r>
-    </w:p>
-    <w:p>
-      <w:pPr>
-        <w:spacing w:after="90"/>
+        <w:spacing w:after="300"/>
       </w:pPr>
       <w:r>
         <w:rPr>
@@ -3184,7 +2551,7 @@
           <w:top w:val="single" w:color="000000" w:sz="12" w:space="3"/>
           <w:bottom w:val="single" w:color="000000" w:sz="4" w:space="3"/>
         </w:pBdr>
-        <w:spacing w:after="80" w:before="200"/>
+        <w:spacing w:after="80" w:before="220"/>
       </w:pPr>
       <w:r>
         <w:rPr>
@@ -3211,7 +2578,7 @@
           <w:sz w:val="21"/>
           <w:szCs w:val="21"/>
         </w:rPr>
-        <w:t xml:space="preserve">Present your home to a partner. Your partner completes this box.</w:t>
+        <w:t xml:space="preserve">Present your dream home to a partner. Your partner completes this box.</w:t>
       </w:r>
     </w:p>
     <w:tbl>
@@ -3242,9 +2609,9 @@
               <w:right w:val="single" w:color="000000" w:sz="6"/>
             </w:tcBorders>
             <w:tcMar>
-              <w:top w:type="dxa" w:w="90"/>
-              <w:left w:type="dxa" w:w="90"/>
-              <w:bottom w:type="dxa" w:w="90"/>
+              <w:top w:type="dxa" w:w="70"/>
+              <w:left w:type="dxa" w:w="90"/>
+              <w:bottom w:type="dxa" w:w="70"/>
               <w:right w:type="dxa" w:w="70"/>
             </w:tcMar>
             <w:vAlign w:val="center"/>
@@ -3273,9 +2640,9 @@
               <w:right w:val="single" w:color="000000" w:sz="6"/>
             </w:tcBorders>
             <w:tcMar>
-              <w:top w:type="dxa" w:w="90"/>
-              <w:left w:type="dxa" w:w="90"/>
-              <w:bottom w:type="dxa" w:w="90"/>
+              <w:top w:type="dxa" w:w="70"/>
+              <w:left w:type="dxa" w:w="90"/>
+              <w:bottom w:type="dxa" w:w="70"/>
               <w:right w:type="dxa" w:w="70"/>
             </w:tcMar>
             <w:vAlign w:val="center"/>
@@ -3304,9 +2671,9 @@
               <w:right w:val="single" w:color="000000" w:sz="6"/>
             </w:tcBorders>
             <w:tcMar>
-              <w:top w:type="dxa" w:w="90"/>
-              <w:left w:type="dxa" w:w="90"/>
-              <w:bottom w:type="dxa" w:w="90"/>
+              <w:top w:type="dxa" w:w="70"/>
+              <w:left w:type="dxa" w:w="90"/>
+              <w:bottom w:type="dxa" w:w="70"/>
               <w:right w:type="dxa" w:w="70"/>
             </w:tcMar>
             <w:vAlign w:val="center"/>
@@ -3337,9 +2704,9 @@
               <w:right w:val="single" w:color="000000" w:sz="6"/>
             </w:tcBorders>
             <w:tcMar>
-              <w:top w:type="dxa" w:w="90"/>
-              <w:left w:type="dxa" w:w="90"/>
-              <w:bottom w:type="dxa" w:w="90"/>
+              <w:top w:type="dxa" w:w="70"/>
+              <w:left w:type="dxa" w:w="90"/>
+              <w:bottom w:type="dxa" w:w="70"/>
               <w:right w:type="dxa" w:w="70"/>
             </w:tcMar>
             <w:vAlign w:val="center"/>
@@ -3366,9 +2733,9 @@
               <w:right w:val="single" w:color="000000" w:sz="6"/>
             </w:tcBorders>
             <w:tcMar>
-              <w:top w:type="dxa" w:w="90"/>
-              <w:left w:type="dxa" w:w="90"/>
-              <w:bottom w:type="dxa" w:w="90"/>
+              <w:top w:type="dxa" w:w="70"/>
+              <w:left w:type="dxa" w:w="90"/>
+              <w:bottom w:type="dxa" w:w="70"/>
               <w:right w:type="dxa" w:w="70"/>
             </w:tcMar>
             <w:vAlign w:val="center"/>
@@ -3395,9 +2762,9 @@
               <w:right w:val="single" w:color="000000" w:sz="6"/>
             </w:tcBorders>
             <w:tcMar>
-              <w:top w:type="dxa" w:w="90"/>
-              <w:left w:type="dxa" w:w="90"/>
-              <w:bottom w:type="dxa" w:w="90"/>
+              <w:top w:type="dxa" w:w="70"/>
+              <w:left w:type="dxa" w:w="90"/>
+              <w:bottom w:type="dxa" w:w="70"/>
               <w:right w:type="dxa" w:w="70"/>
             </w:tcMar>
             <w:vAlign w:val="center"/>
@@ -3426,9 +2793,9 @@
               <w:right w:val="single" w:color="000000" w:sz="6"/>
             </w:tcBorders>
             <w:tcMar>
-              <w:top w:type="dxa" w:w="90"/>
-              <w:left w:type="dxa" w:w="90"/>
-              <w:bottom w:type="dxa" w:w="90"/>
+              <w:top w:type="dxa" w:w="70"/>
+              <w:left w:type="dxa" w:w="90"/>
+              <w:bottom w:type="dxa" w:w="70"/>
               <w:right w:type="dxa" w:w="70"/>
             </w:tcMar>
             <w:vAlign w:val="center"/>
@@ -3455,9 +2822,9 @@
               <w:right w:val="single" w:color="000000" w:sz="6"/>
             </w:tcBorders>
             <w:tcMar>
-              <w:top w:type="dxa" w:w="90"/>
-              <w:left w:type="dxa" w:w="90"/>
-              <w:bottom w:type="dxa" w:w="90"/>
+              <w:top w:type="dxa" w:w="70"/>
+              <w:left w:type="dxa" w:w="90"/>
+              <w:bottom w:type="dxa" w:w="70"/>
               <w:right w:type="dxa" w:w="70"/>
             </w:tcMar>
             <w:vAlign w:val="center"/>
@@ -3484,9 +2851,9 @@
               <w:right w:val="single" w:color="000000" w:sz="6"/>
             </w:tcBorders>
             <w:tcMar>
-              <w:top w:type="dxa" w:w="90"/>
-              <w:left w:type="dxa" w:w="90"/>
-              <w:bottom w:type="dxa" w:w="90"/>
+              <w:top w:type="dxa" w:w="70"/>
+              <w:left w:type="dxa" w:w="90"/>
+              <w:bottom w:type="dxa" w:w="70"/>
               <w:right w:type="dxa" w:w="70"/>
             </w:tcMar>
             <w:vAlign w:val="center"/>
@@ -3515,9 +2882,9 @@
               <w:right w:val="single" w:color="000000" w:sz="6"/>
             </w:tcBorders>
             <w:tcMar>
-              <w:top w:type="dxa" w:w="90"/>
-              <w:left w:type="dxa" w:w="90"/>
-              <w:bottom w:type="dxa" w:w="90"/>
+              <w:top w:type="dxa" w:w="70"/>
+              <w:left w:type="dxa" w:w="90"/>
+              <w:bottom w:type="dxa" w:w="70"/>
               <w:right w:type="dxa" w:w="70"/>
             </w:tcMar>
             <w:vAlign w:val="center"/>
@@ -3544,9 +2911,9 @@
               <w:right w:val="single" w:color="000000" w:sz="6"/>
             </w:tcBorders>
             <w:tcMar>
-              <w:top w:type="dxa" w:w="90"/>
-              <w:left w:type="dxa" w:w="90"/>
-              <w:bottom w:type="dxa" w:w="90"/>
+              <w:top w:type="dxa" w:w="70"/>
+              <w:left w:type="dxa" w:w="90"/>
+              <w:bottom w:type="dxa" w:w="70"/>
               <w:right w:type="dxa" w:w="70"/>
             </w:tcMar>
             <w:vAlign w:val="center"/>
@@ -3573,9 +2940,9 @@
               <w:right w:val="single" w:color="000000" w:sz="6"/>
             </w:tcBorders>
             <w:tcMar>
-              <w:top w:type="dxa" w:w="90"/>
-              <w:left w:type="dxa" w:w="90"/>
-              <w:bottom w:type="dxa" w:w="90"/>
+              <w:top w:type="dxa" w:w="70"/>
+              <w:left w:type="dxa" w:w="90"/>
+              <w:bottom w:type="dxa" w:w="70"/>
               <w:right w:type="dxa" w:w="70"/>
             </w:tcMar>
             <w:vAlign w:val="center"/>
@@ -3604,9 +2971,9 @@
               <w:right w:val="single" w:color="000000" w:sz="6"/>
             </w:tcBorders>
             <w:tcMar>
-              <w:top w:type="dxa" w:w="90"/>
-              <w:left w:type="dxa" w:w="90"/>
-              <w:bottom w:type="dxa" w:w="90"/>
+              <w:top w:type="dxa" w:w="70"/>
+              <w:left w:type="dxa" w:w="90"/>
+              <w:bottom w:type="dxa" w:w="70"/>
               <w:right w:type="dxa" w:w="70"/>
             </w:tcMar>
             <w:vAlign w:val="center"/>
@@ -3633,9 +3000,9 @@
               <w:right w:val="single" w:color="000000" w:sz="6"/>
             </w:tcBorders>
             <w:tcMar>
-              <w:top w:type="dxa" w:w="90"/>
-              <w:left w:type="dxa" w:w="90"/>
-              <w:bottom w:type="dxa" w:w="90"/>
+              <w:top w:type="dxa" w:w="70"/>
+              <w:left w:type="dxa" w:w="90"/>
+              <w:bottom w:type="dxa" w:w="70"/>
               <w:right w:type="dxa" w:w="70"/>
             </w:tcMar>
             <w:vAlign w:val="center"/>
@@ -3662,9 +3029,9 @@
               <w:right w:val="single" w:color="000000" w:sz="6"/>
             </w:tcBorders>
             <w:tcMar>
-              <w:top w:type="dxa" w:w="90"/>
-              <w:left w:type="dxa" w:w="90"/>
-              <w:bottom w:type="dxa" w:w="90"/>
+              <w:top w:type="dxa" w:w="70"/>
+              <w:left w:type="dxa" w:w="90"/>
+              <w:bottom w:type="dxa" w:w="70"/>
               <w:right w:type="dxa" w:w="70"/>
             </w:tcMar>
             <w:vAlign w:val="center"/>
@@ -3685,7 +3052,7 @@
     </w:tbl>
     <w:p>
       <w:pPr>
-        <w:spacing w:after="70" w:before="90"/>
+        <w:spacing w:after="90" w:before="130"/>
       </w:pPr>
       <w:r>
         <w:rPr>
@@ -3710,7 +3077,7 @@
     </w:p>
     <w:p>
       <w:pPr>
-        <w:spacing w:after="70"/>
+        <w:spacing w:after="90"/>
       </w:pPr>
       <w:r>
         <w:rPr>

</xml_diff>